<commit_message>
Update architecture document for the Week 8 release
</commit_message>
<xml_diff>
--- a/docs/architecture/QA_Agent_Architecture_Week1.docx
+++ b/docs/architecture/QA_Agent_Architecture_Week1.docx
@@ -1230,7 +1230,7 @@
                 <w:vanish w:val="false"/>
               </w:rPr>
               <w:tab/>
-              <w:t>7</w:t>
+              <w:t>6</w:t>
             </w:r>
             <w:r>
               <w:rPr>
@@ -1295,7 +1295,7 @@
                 <w:vanish w:val="false"/>
               </w:rPr>
               <w:tab/>
-              <w:t>11</w:t>
+              <w:t>7</w:t>
             </w:r>
             <w:r>
               <w:rPr>
@@ -1404,7 +1404,7 @@
           <w:rPr>
             <w:rStyle w:val="IndexLink"/>
           </w:rPr>
-          <w:t>Figure 3.1: System Context and Human-Decision Boundaries. Amber indicates a boundary that requires a human decision or an isolated execution environment.</w:t>
+          <w:t>Figure 3.1: System Context and Human-Decision Boundaries. Amber marks the test subprocess, which runs only after approval and is not isolated.</w:t>
         </w:r>
         <w:r>
           <w:rPr>
@@ -1460,14 +1460,7 @@
           <w:rPr>
             <w:rStyle w:val="IndexLink"/>
           </w:rPr>
-          <w:t xml:space="preserve">Figure 4.1: Container View across Five Trust Zones. </w:t>
-        </w:r>
-        <w:r>
-          <w:rPr>
-            <w:rStyle w:val="IndexLink"/>
-            <w:bCs/>
-          </w:rPr>
-          <w:t>Zones</w:t>
+          <w:t xml:space="preserve">Figure 4.1: Container View across Five Trust Zones. Amber marks the approval gate and the zones that rely on a human decision or have limited isolation.</w:t>
         </w:r>
         <w:r>
           <w:rPr>
@@ -1493,7 +1486,7 @@
             <w:vanish w:val="false"/>
           </w:rPr>
           <w:tab/>
-          <w:t>7</w:t>
+          <w:t>6</w:t>
         </w:r>
         <w:r>
           <w:rPr>
@@ -1764,7 +1757,7 @@
             <w:vanish w:val="false"/>
           </w:rPr>
           <w:tab/>
-          <w:t>7</w:t>
+          <w:t>6</w:t>
         </w:r>
         <w:r>
           <w:rPr>
@@ -1835,7 +1828,7 @@
       </w:pPr>
       <w:r>
         <w:rPr/>
-        <w:t>This document specifies the architecture of the Software-Engineering QA Agent: its context boundary, its containers, the trust zones they sit in, and the interfaces between them. It is the Week 1 architecture and context deliverable.</w:t>
+        <w:t xml:space="preserve">This document specifies the architecture of the Software-Engineering QA Agent: its context boundary, its containers, the trust zones they sit in, and the interfaces between them. It was first written as the Week 1 architecture and context deliverable and has been updated for the Week 8 release (tag v1.0.0), so it now describes the system as implemented.</w:t>
       </w:r>
     </w:p>
     <w:p>
@@ -1846,7 +1839,7 @@
       </w:pPr>
       <w:r>
         <w:rPr/>
-        <w:t>The full specification the team builds against container responsibilities, tool contracts, the interface register, the end-to-end request trace, the control-to-container mapping, assumptions and the build order is maintained separately in docs/architecture/full-spec.md. This document carries only the Week 1 architecture and context deliverable.</w:t>
+        <w:t xml:space="preserve">The Week 1 design assumed a web interface, a disposable network-disabled sandbox container and a token-scoped GitHub client. None of these was built. This version describes what the code provides instead: Python interfaces and command-line scripts, an allow-listed test subprocess, and an issue draft that a person posts. Final report Section 3 (docs/integration/week8-member2-system-architecture.md) names the module behind each component, and the editable diagrams are in docs/architecture/qa-agent-architecture (1).drawio.</w:t>
       </w:r>
     </w:p>
     <w:p>
@@ -1879,7 +1872,7 @@
       </w:pPr>
       <w:r>
         <w:rPr/>
-        <w:t>A QA engineer asks the system to triage a failing or newly changed area of a repository. The system grounds itself in that repository's requirements, documentation and code, proposes tests, runs approved existing tests in a sandbox, explains what failed and why, and drafts an issue or pull-request note for a human to review and post.</w:t>
+        <w:t xml:space="preserve">A QA engineer asks the system to triage a failing or newly changed area of a repository. The system grounds itself in a provenance-tagged corpus of that repository's requirements, documentation and code, proposes tests, runs approved existing tests in a subprocess, explains what failed and why, and drafts an issue for a human to review and post.</w:t>
       </w:r>
     </w:p>
     <w:p>
@@ -1929,6 +1922,7 @@
     <w:p>
       <w:pPr>
         <w:pStyle w:val="Caption"/>
+        <w:keepNext/>
         <w:spacing w:lineRule="auto" w:line="240"/>
         <w:rPr/>
       </w:pPr>
@@ -1940,35 +1934,19 @@
       </w:r>
       <w:r>
         <w:rPr/>
+        <w:t>2</w:t>
+      </w:r>
+      <w:r>
+        <w:rPr/>
+        <w:t>.</w:t>
+      </w:r>
+      <w:r>
+        <w:rPr/>
         <w:fldChar w:fldCharType="begin"/>
       </w:r>
       <w:r>
         <w:rPr/>
-        <w:instrText xml:space="preserve"> STYLEREF "1" </w:instrText>
-      </w:r>
-      <w:r>
-        <w:rPr/>
-        <w:fldChar w:fldCharType="separate"/>
-      </w:r>
-      <w:r>
-        <w:rPr/>
-        <w:t>Architectural principles</w:t>
-      </w:r>
-      <w:r>
-        <w:rPr/>
-        <w:fldChar w:fldCharType="end"/>
-      </w:r>
-      <w:r>
-        <w:rPr/>
-        <w:t>.</w:t>
-      </w:r>
-      <w:r>
-        <w:rPr/>
-        <w:fldChar w:fldCharType="begin"/>
-      </w:r>
-      <w:r>
-        <w:rPr/>
-        <w:instrText xml:space="preserve"> SEQ Table \* ARABIC </w:instrText>
+        <w:instrText xml:space="preserve"> SEQ Table \r 1 \* ARABIC </w:instrText>
       </w:r>
       <w:r>
         <w:rPr/>
@@ -2172,7 +2150,7 @@
                 <w:szCs w:val="21"/>
                 <w:lang w:val="en-US" w:eastAsia="en-US" w:bidi="ar-SA"/>
               </w:rPr>
-              <w:t>Every tool-call request returned by the model is validated against a schema, an allow-list and a permission rule before anything executes. The agent runtime holds no credentials and touches no store directly.</w:t>
+              <w:t xml:space="preserve">Every action the model proposes is parsed as a ProposalSet, its citations are checked against the current context, and the dispatcher validates it against the fixed tool registry, the caller's role and the tool's argument schema before anything executes. The AgentLoop does not call the memory store directly.</w:t>
             </w:r>
           </w:p>
         </w:tc>
@@ -2256,7 +2234,7 @@
                 <w:szCs w:val="21"/>
                 <w:lang w:val="en-US" w:eastAsia="en-US" w:bidi="ar-SA"/>
               </w:rPr>
-              <w:t>The orchestrator is the sole path to the tool layer. There is no second route from the agent runtime to the filesystem, the sandbox, the network or the stores.</w:t>
+              <w:t xml:space="preserve">ToolDispatcher is the only route to the registered tools: search_repo, read_file, run_tests and draft_issue. The AgentLoop dispatches at most one action per turn and has no other path to a tool.</w:t>
             </w:r>
           </w:p>
         </w:tc>
@@ -2340,7 +2318,7 @@
                 <w:szCs w:val="21"/>
                 <w:lang w:val="en-US" w:eastAsia="en-US" w:bidi="ar-SA"/>
               </w:rPr>
-              <w:t>Test execution and any external write pass through an approval gate that blocks on a human decision. There is no timeout that auto-approves.</w:t>
+              <w:t xml:space="preserve">run_tests and draft_issue need a human decision at the approval gate. A pending request pauses the session, and a request left unanswered expires as a denial; nothing is approved by timeout. Each decision is recorded with who made it and when.</w:t>
             </w:r>
           </w:p>
         </w:tc>
@@ -2424,7 +2402,7 @@
                 <w:szCs w:val="21"/>
                 <w:lang w:val="en-US" w:eastAsia="en-US" w:bidi="ar-SA"/>
               </w:rPr>
-              <w:t>The target repository is cloned at a fixed tag. Nothing in the system writes to it. This makes the evaluation set reproducible.</w:t>
+              <w:t xml:space="preserve">The corpus is a curated set of repository files, copied as plain text into knowledge/corpus/ and listed with a SHA-256 hash in knowledge/source-register.json. None of the agent's tools writes to it, and each retrieval result carries a corpus fingerprint, so evaluation runs are reproducible.</w:t>
             </w:r>
           </w:p>
         </w:tc>
@@ -2481,7 +2459,7 @@
                 <w:szCs w:val="21"/>
                 <w:lang w:val="en-US" w:eastAsia="en-US" w:bidi="ar-SA"/>
               </w:rPr>
-              <w:t>Observability is built first, not last</w:t>
+              <w:t xml:space="preserve">Every run can be reviewed</w:t>
             </w:r>
           </w:p>
         </w:tc>
@@ -2508,7 +2486,7 @@
                 <w:szCs w:val="21"/>
                 <w:lang w:val="en-US" w:eastAsia="en-US" w:bidi="ar-SA"/>
               </w:rPr>
-              <w:t>The trace store and prompt registry land in Week 2 alongside the first model call, so Week 7 has a history to analyse rather than a reconstruction to attempt.</w:t>
+              <w:t xml:space="preserve">Prompts are loaded by id and version from docs/prompts/. RunLogger writes run events as JSON Lines, and the step telemetry recorder adds timing and outcome metadata for each step without copying prompt text, retrieved text or tool values.</w:t>
             </w:r>
           </w:p>
         </w:tc>
@@ -2544,12 +2522,13 @@
       </w:pPr>
       <w:r>
         <w:rPr/>
-        <w:t>One primary user, one system in scope, four external dependencies at three different trust levels.</w:t>
+        <w:t xml:space="preserve">One primary user, one system in scope, and four external parties at different trust levels.</w:t>
       </w:r>
     </w:p>
     <w:p>
       <w:pPr>
         <w:pStyle w:val="Normal"/>
+        <w:keepNext/>
         <w:spacing w:before="160" w:after="60"/>
         <w:jc w:val="center"/>
         <w:rPr/>
@@ -2616,11 +2595,19 @@
       </w:r>
       <w:r>
         <w:rPr/>
+        <w:t>3</w:t>
+      </w:r>
+      <w:r>
+        <w:rPr/>
+        <w:t>.</w:t>
+      </w:r>
+      <w:r>
+        <w:rPr/>
         <w:fldChar w:fldCharType="begin"/>
       </w:r>
       <w:r>
         <w:rPr/>
-        <w:instrText xml:space="preserve"> STYLEREF "1" </w:instrText>
+        <w:instrText xml:space="preserve"> SEQ Figure \r 1 \* ARABIC </w:instrText>
       </w:r>
       <w:r>
         <w:rPr/>
@@ -2628,7 +2615,7 @@
       </w:r>
       <w:r>
         <w:rPr/>
-        <w:t>System context</w:t>
+        <w:t>1</w:t>
       </w:r>
       <w:r>
         <w:rPr/>
@@ -2636,31 +2623,7 @@
       </w:r>
       <w:r>
         <w:rPr/>
-        <w:t>.</w:t>
-      </w:r>
-      <w:r>
-        <w:rPr/>
-        <w:fldChar w:fldCharType="begin"/>
-      </w:r>
-      <w:r>
-        <w:rPr/>
-        <w:instrText xml:space="preserve"> SEQ Figure \* ARABIC </w:instrText>
-      </w:r>
-      <w:r>
-        <w:rPr/>
-        <w:fldChar w:fldCharType="separate"/>
-      </w:r>
-      <w:r>
-        <w:rPr/>
-        <w:t>1</w:t>
-      </w:r>
-      <w:r>
-        <w:rPr/>
-        <w:fldChar w:fldCharType="end"/>
-      </w:r>
-      <w:r>
-        <w:rPr/>
-        <w:t xml:space="preserve">: System Context and Human-Decision Boundaries. </w:t>
+        <w:t xml:space="preserve">: System Context and Human-Decision Boundaries. Amber marks the test subprocess, which runs only after approval and is not isolated.</w:t>
       </w:r>
       <w:bookmarkEnd w:id="13"/>
       <w:bookmarkEnd w:id="14"/>
@@ -2668,6 +2631,7 @@
     <w:p>
       <w:pPr>
         <w:pStyle w:val="Caption"/>
+        <w:keepNext/>
         <w:spacing w:lineRule="auto" w:line="240"/>
         <w:rPr/>
       </w:pPr>
@@ -2679,11 +2643,19 @@
       </w:r>
       <w:r>
         <w:rPr/>
+        <w:t>3</w:t>
+      </w:r>
+      <w:r>
+        <w:rPr/>
+        <w:t>.</w:t>
+      </w:r>
+      <w:r>
+        <w:rPr/>
         <w:fldChar w:fldCharType="begin"/>
       </w:r>
       <w:r>
         <w:rPr/>
-        <w:instrText xml:space="preserve"> STYLEREF "1" </w:instrText>
+        <w:instrText xml:space="preserve"> SEQ Table \r 1 \* ARABIC </w:instrText>
       </w:r>
       <w:r>
         <w:rPr/>
@@ -2691,31 +2663,7 @@
       </w:r>
       <w:r>
         <w:rPr/>
-        <w:t>System context</w:t>
-      </w:r>
-      <w:r>
-        <w:rPr/>
-        <w:fldChar w:fldCharType="end"/>
-      </w:r>
-      <w:r>
-        <w:rPr/>
-        <w:t>.</w:t>
-      </w:r>
-      <w:r>
-        <w:rPr/>
-        <w:fldChar w:fldCharType="begin"/>
-      </w:r>
-      <w:r>
-        <w:rPr/>
-        <w:instrText xml:space="preserve"> SEQ Table \* ARABIC </w:instrText>
-      </w:r>
-      <w:r>
-        <w:rPr/>
-        <w:fldChar w:fldCharType="separate"/>
-      </w:r>
-      <w:r>
-        <w:rPr/>
-        <w:t>2</w:t>
+        <w:t>1</w:t>
       </w:r>
       <w:r>
         <w:rPr/>
@@ -2866,7 +2814,7 @@
                 <w:szCs w:val="21"/>
                 <w:lang w:val="en-US" w:eastAsia="en-US" w:bidi="ar-SA"/>
               </w:rPr>
-              <w:t>Opens a triage request. Approves or rejects the scope of test execution. Reviews the drafted issue and decides whether it is posted. The only human role in scope; no reviewer or administrator persona is modelled.</w:t>
+              <w:t>Starts a session through the Python interfaces or command-line scripts. Approves or rejects each run_tests and draft_issue request at the human approval gate; a pending request pauses the session and is never approved by timeout. Reviews the in-memory issue draft and, if appropriate, posts it outside the system. The only human role in scope; no reviewer or administrator persona is modelled.</w:t>
             </w:r>
           </w:p>
         </w:tc>
@@ -2897,6 +2845,7 @@
     <w:p>
       <w:pPr>
         <w:pStyle w:val="Caption"/>
+        <w:keepNext/>
         <w:spacing w:lineRule="auto" w:line="240"/>
         <w:rPr/>
       </w:pPr>
@@ -2908,11 +2857,19 @@
       </w:r>
       <w:r>
         <w:rPr/>
+        <w:t>3</w:t>
+      </w:r>
+      <w:r>
+        <w:rPr/>
+        <w:t>.</w:t>
+      </w:r>
+      <w:r>
+        <w:rPr/>
         <w:fldChar w:fldCharType="begin"/>
       </w:r>
       <w:r>
         <w:rPr/>
-        <w:instrText xml:space="preserve"> STYLEREF "1" </w:instrText>
+        <w:instrText xml:space="preserve"> SEQ Table \r 2 \* ARABIC </w:instrText>
       </w:r>
       <w:r>
         <w:rPr/>
@@ -2920,31 +2877,7 @@
       </w:r>
       <w:r>
         <w:rPr/>
-        <w:t>System context</w:t>
-      </w:r>
-      <w:r>
-        <w:rPr/>
-        <w:fldChar w:fldCharType="end"/>
-      </w:r>
-      <w:r>
-        <w:rPr/>
-        <w:t>.</w:t>
-      </w:r>
-      <w:r>
-        <w:rPr/>
-        <w:fldChar w:fldCharType="begin"/>
-      </w:r>
-      <w:r>
-        <w:rPr/>
-        <w:instrText xml:space="preserve"> SEQ Table \* ARABIC </w:instrText>
-      </w:r>
-      <w:r>
-        <w:rPr/>
-        <w:fldChar w:fldCharType="separate"/>
-      </w:r>
-      <w:r>
-        <w:rPr/>
-        <w:t>3</w:t>
+        <w:t>2</w:t>
       </w:r>
       <w:r>
         <w:rPr/>
@@ -3154,7 +3087,7 @@
                 <w:szCs w:val="21"/>
                 <w:lang w:val="en-US" w:eastAsia="en-US" w:bidi="ar-SA"/>
               </w:rPr>
-              <w:t>Receives a versioned prompt, the retrieved context bundle and the declared tool schemas. Returns text and tool-call requests. Nothing it returns is executed without validation.</w:t>
+              <w:t>Called over HTTPS by the configured model client, for live calls only; tests and scenario runs use scripted responses. Receives the versioned propose_action prompt (v1.3) and the assembled context. Returns a structured ProposalSet that is parsed and citation-checked; nothing it returns reaches a tool without validation by the dispatcher.</w:t>
             </w:r>
           </w:p>
         </w:tc>
@@ -3185,7 +3118,7 @@
                 <w:szCs w:val="21"/>
                 <w:lang w:val="en-US" w:eastAsia="en-US" w:bidi="ar-SA"/>
               </w:rPr>
-              <w:t>Frozen target repository</w:t>
+              <w:t>Repository and corpus</w:t>
             </w:r>
           </w:p>
         </w:tc>
@@ -3241,7 +3174,7 @@
                 <w:szCs w:val="21"/>
                 <w:lang w:val="en-US" w:eastAsia="en-US" w:bidi="ar-SA"/>
               </w:rPr>
-              <w:t>Source of requirements, README, testing conventions, source code, the existing test suite and past issue text. Cloned at a fixed tag. Also the system's prompt-injection surface, since a docstring or comment can carry instructions.</w:t>
+              <w:t>Local, provenance-tagged corpus (requirements, documentation, logs, source and tests) read by retrieval, search_repo and read_file. Also the prompt-injection surface: the context builder redacts credential patterns and neutralises reserved delimiters, and injection or credential flags are recorded in the run trace for human review.</w:t>
             </w:r>
           </w:p>
         </w:tc>
@@ -3272,7 +3205,7 @@
                 <w:szCs w:val="21"/>
                 <w:lang w:val="en-US" w:eastAsia="en-US" w:bidi="ar-SA"/>
               </w:rPr>
-              <w:t>Sandbox runtime</w:t>
+              <w:t>Test subprocess</w:t>
             </w:r>
           </w:p>
         </w:tc>
@@ -3328,7 +3261,7 @@
                 <w:szCs w:val="21"/>
                 <w:lang w:val="en-US" w:eastAsia="en-US" w:bidi="ar-SA"/>
               </w:rPr>
-              <w:t>Runs allow-listed test node IDs in a disposable container with no network access, no credentials in the environment and a hard timeout.</w:t>
+              <w:t>Runs one allow-listed, existing pytest node in a subprocess with a stripped environment and a hard timeout, only after human approval. It is not a disposable container: test code keeps the process's filesystem permissions and network access, so only reviewed, trusted tests should be run.</w:t>
             </w:r>
           </w:p>
         </w:tc>
@@ -3359,7 +3292,7 @@
                 <w:szCs w:val="21"/>
                 <w:lang w:val="en-US" w:eastAsia="en-US" w:bidi="ar-SA"/>
               </w:rPr>
-              <w:t>GitHub API</w:t>
+              <w:t>GitHub</w:t>
             </w:r>
           </w:p>
         </w:tc>
@@ -3387,7 +3320,7 @@
                 <w:szCs w:val="21"/>
                 <w:lang w:val="en-US" w:eastAsia="en-US" w:bidi="ar-SA"/>
               </w:rPr>
-              <w:t>Write, human-gated</w:t>
+              <w:t>Outside the system</w:t>
             </w:r>
           </w:p>
         </w:tc>
@@ -3415,7 +3348,7 @@
                 <w:szCs w:val="21"/>
                 <w:lang w:val="en-US" w:eastAsia="en-US" w:bidi="ar-SA"/>
               </w:rPr>
-              <w:t>Issue and pull-request-note creation against one repository, with an issues:write-scoped token. Reachable only after an explicit human approval.</w:t>
+              <w:t>No GitHub API client or token is included. draft_issue stores an approved issue draft in memory; the QA engineer reviews it and posts it manually.</w:t>
             </w:r>
           </w:p>
         </w:tc>
@@ -3457,6 +3390,7 @@
     <w:p>
       <w:pPr>
         <w:pStyle w:val="Normal"/>
+        <w:keepNext/>
         <w:spacing w:before="160" w:after="60"/>
         <w:jc w:val="center"/>
         <w:rPr/>
@@ -3465,9 +3399,9 @@
         <w:rPr/>
         <w:drawing>
           <wp:inline distT="0" distB="0" distL="0" distR="0">
-            <wp:extent cx="6188710" cy="2232025"/>
+            <wp:extent cx="6188710" cy="4206549"/>
             <wp:effectExtent l="0" t="0" r="0" b="0"/>
-            <wp:docPr id="3" name="Image2" descr=""/>
+            <wp:docPr id="3" name="Image2" descr="Container view of the QA agent across five trust zones, as implemented for the Week 8 release."/>
             <wp:cNvGraphicFramePr>
               <a:graphicFrameLocks xmlns:a="http://schemas.openxmlformats.org/drawingml/2006/main" noChangeAspect="1"/>
             </wp:cNvGraphicFramePr>
@@ -3489,7 +3423,7 @@
                   <pic:spPr bwMode="auto">
                     <a:xfrm>
                       <a:off x="0" y="0"/>
-                      <a:ext cx="6188710" cy="2232025"/>
+                      <a:ext cx="6188710" cy="4206549"/>
                     </a:xfrm>
                     <a:prstGeom prst="rect">
                       <a:avLst/>
@@ -3522,11 +3456,19 @@
       </w:r>
       <w:r>
         <w:rPr/>
+        <w:t>4</w:t>
+      </w:r>
+      <w:r>
+        <w:rPr/>
+        <w:t>.</w:t>
+      </w:r>
+      <w:r>
+        <w:rPr/>
         <w:fldChar w:fldCharType="begin"/>
       </w:r>
       <w:r>
         <w:rPr/>
-        <w:instrText xml:space="preserve"> STYLEREF "1" </w:instrText>
+        <w:instrText xml:space="preserve"> SEQ Figure \r 1 \* ARABIC </w:instrText>
       </w:r>
       <w:r>
         <w:rPr/>
@@ -3534,7 +3476,7 @@
       </w:r>
       <w:r>
         <w:rPr/>
-        <w:t>Container view and trust zones</w:t>
+        <w:t>1</w:t>
       </w:r>
       <w:r>
         <w:rPr/>
@@ -3542,47 +3484,17 @@
       </w:r>
       <w:r>
         <w:rPr/>
-        <w:t>.</w:t>
-      </w:r>
-      <w:r>
-        <w:rPr/>
-        <w:fldChar w:fldCharType="begin"/>
-      </w:r>
-      <w:r>
-        <w:rPr/>
-        <w:instrText xml:space="preserve"> SEQ Figure \* ARABIC </w:instrText>
-      </w:r>
-      <w:r>
-        <w:rPr/>
-        <w:fldChar w:fldCharType="separate"/>
-      </w:r>
-      <w:r>
-        <w:rPr/>
-        <w:t>2</w:t>
-      </w:r>
-      <w:r>
-        <w:rPr/>
-        <w:fldChar w:fldCharType="end"/>
-      </w:r>
-      <w:r>
-        <w:rPr/>
-        <w:t xml:space="preserve">: Container View across Five Trust Zones. </w:t>
+        <w:t xml:space="preserve">: Container View across Five Trust Zones. Amber marks the approval gate and the zones that rely on a human decision or have limited isolation.</w:t>
       </w:r>
       <w:bookmarkStart w:id="25" w:name="_Toc239365248"/>
       <w:bookmarkEnd w:id="24"/>
-      <w:r>
-        <w:rPr>
-          <w:bCs/>
-          <w:szCs w:val="22"/>
-        </w:rPr>
-        <w:t>Zones</w:t>
-      </w:r>
       <w:bookmarkEnd w:id="23"/>
       <w:bookmarkEnd w:id="25"/>
     </w:p>
     <w:p>
       <w:pPr>
         <w:pStyle w:val="Caption"/>
+        <w:keepNext/>
         <w:spacing w:lineRule="auto" w:line="240"/>
         <w:rPr/>
       </w:pPr>
@@ -3594,11 +3506,19 @@
       </w:r>
       <w:r>
         <w:rPr/>
+        <w:t>4</w:t>
+      </w:r>
+      <w:r>
+        <w:rPr/>
+        <w:t>.</w:t>
+      </w:r>
+      <w:r>
+        <w:rPr/>
         <w:fldChar w:fldCharType="begin"/>
       </w:r>
       <w:r>
         <w:rPr/>
-        <w:instrText xml:space="preserve"> STYLEREF "1" </w:instrText>
+        <w:instrText xml:space="preserve"> SEQ Table \r 1 \* ARABIC </w:instrText>
       </w:r>
       <w:r>
         <w:rPr/>
@@ -3606,31 +3526,7 @@
       </w:r>
       <w:r>
         <w:rPr/>
-        <w:t>Container view and trust zones</w:t>
-      </w:r>
-      <w:r>
-        <w:rPr/>
-        <w:fldChar w:fldCharType="end"/>
-      </w:r>
-      <w:r>
-        <w:rPr/>
-        <w:t>.</w:t>
-      </w:r>
-      <w:r>
-        <w:rPr/>
-        <w:fldChar w:fldCharType="begin"/>
-      </w:r>
-      <w:r>
-        <w:rPr/>
-        <w:instrText xml:space="preserve"> SEQ Table \* ARABIC </w:instrText>
-      </w:r>
-      <w:r>
-        <w:rPr/>
-        <w:fldChar w:fldCharType="separate"/>
-      </w:r>
-      <w:r>
-        <w:rPr/>
-        <w:t>4</w:t>
+        <w:t>1</w:t>
       </w:r>
       <w:r>
         <w:rPr/>
@@ -3812,7 +3708,7 @@
                 <w:szCs w:val="21"/>
                 <w:lang w:val="en-US" w:eastAsia="en-US" w:bidi="ar-SA"/>
               </w:rPr>
-              <w:t>Browser</w:t>
+              <w:t xml:space="preserve">Caller</w:t>
             </w:r>
           </w:p>
         </w:tc>
@@ -3840,7 +3736,7 @@
                 <w:szCs w:val="21"/>
                 <w:lang w:val="en-US" w:eastAsia="en-US" w:bidi="ar-SA"/>
               </w:rPr>
-              <w:t>Untrusted client. Holds no credentials, calls nothing but the orchestrator.</w:t>
+              <w:t xml:space="preserve">Python interfaces and command-line scripts start a session and record approval decisions. A session enters through the task adapter, which validates the task contract and the declared tools. No web interface is included.</w:t>
             </w:r>
           </w:p>
         </w:tc>
@@ -3899,7 +3795,7 @@
                 <w:szCs w:val="21"/>
                 <w:lang w:val="en-US" w:eastAsia="en-US" w:bidi="ar-SA"/>
               </w:rPr>
-              <w:t>Application</w:t>
+              <w:t xml:space="preserve">Application</w:t>
             </w:r>
           </w:p>
         </w:tc>
@@ -3927,7 +3823,7 @@
                 <w:szCs w:val="21"/>
                 <w:lang w:val="en-US" w:eastAsia="en-US" w:bidi="ar-SA"/>
               </w:rPr>
-              <w:t>Trusted and deterministic. Every control that must not be an LLM decision lives here: authorization, allow-lists, validation, limits, audit.</w:t>
+              <w:t xml:space="preserve">Trusted and deterministic. Every control that must not be an LLM decision lives here: the fixed tool registry, role and argument validation, citation checks, the approval gate, stop conditions, retrieval safeguards, memory and the run log.</w:t>
             </w:r>
           </w:p>
         </w:tc>
@@ -3986,7 +3882,7 @@
                 <w:szCs w:val="21"/>
                 <w:lang w:val="en-US" w:eastAsia="en-US" w:bidi="ar-SA"/>
               </w:rPr>
-              <w:t>Agent runtime</w:t>
+              <w:t xml:space="preserve">Agent runtime</w:t>
             </w:r>
           </w:p>
         </w:tc>
@@ -4014,7 +3910,7 @@
                 <w:szCs w:val="21"/>
                 <w:lang w:val="en-US" w:eastAsia="en-US" w:bidi="ar-SA"/>
               </w:rPr>
-              <w:t>The model's output is treated as untrusted. The runtime proposes actions and never executes them, holds no credentials, and cannot widen its own permissions or raise its own iteration cap.</w:t>
+              <w:t xml:space="preserve">The AgentLoop and the model client. The model's output is parsed as a ProposalSet and treated as untrusted. The loop runs a bounded sense, plan, validate, act and observe cycle, dispatches at most one action per turn, and takes its iteration and time limits from the task contract.</w:t>
             </w:r>
           </w:p>
         </w:tc>
@@ -4073,7 +3969,7 @@
                 <w:szCs w:val="21"/>
                 <w:lang w:val="en-US" w:eastAsia="en-US" w:bidi="ar-SA"/>
               </w:rPr>
-              <w:t>Sandbox</w:t>
+              <w:t xml:space="preserve">Test subprocess</w:t>
             </w:r>
           </w:p>
         </w:tc>
@@ -4101,7 +3997,7 @@
                 <w:szCs w:val="21"/>
                 <w:lang w:val="en-US" w:eastAsia="en-US" w:bidi="ar-SA"/>
               </w:rPr>
-              <w:t>Untrusted execution, and the highest-risk boundary in the system. Disposable, network-disabled, credential-free.</w:t>
+              <w:t xml:space="preserve">Untrusted execution with limited controls. Each allow-listed, existing pytest node runs in its own subprocess with a stripped environment and a hard timeout. Test code keeps the process's filesystem permissions and network access, so only reviewed, trusted tests are run.</w:t>
             </w:r>
           </w:p>
         </w:tc>
@@ -4160,7 +4056,7 @@
                 <w:szCs w:val="21"/>
                 <w:lang w:val="en-US" w:eastAsia="en-US" w:bidi="ar-SA"/>
               </w:rPr>
-              <w:t>External write</w:t>
+              <w:t xml:space="preserve">Human handoff</w:t>
             </w:r>
           </w:p>
         </w:tc>
@@ -4188,7 +4084,7 @@
                 <w:szCs w:val="21"/>
                 <w:lang w:val="en-US" w:eastAsia="en-US" w:bidi="ar-SA"/>
               </w:rPr>
-              <w:t>Reachable only through the approval gate. The only place the system affects anything outside itself.</w:t>
+              <w:t xml:space="preserve">Outside the application. draft_issue keeps an approved issue draft in memory; a person reviews it and posts it to GitHub. The repository contains no GitHub client or posting token.</w:t>
             </w:r>
           </w:p>
         </w:tc>
@@ -4219,6 +4115,7 @@
     <w:p>
       <w:pPr>
         <w:pStyle w:val="Normal"/>
+        <w:keepNext/>
         <w:spacing w:lineRule="auto" w:line="276" w:before="0" w:after="120"/>
         <w:rPr/>
       </w:pPr>
@@ -4299,7 +4196,22 @@
       </w:pPr>
       <w:r>
         <w:rPr/>
-        <w:t>Network access from inside the sandbox.</w:t>
+        <w:t xml:space="preserve">Filesystem and network isolation for the test subprocess. This is a known limitation of the release, so only reviewed, trusted tests are run.</w:t>
+      </w:r>
+    </w:p>
+    <w:p>
+      <w:pPr>
+        <w:pStyle w:val="ListParagraph"/>
+        <w:numPr>
+          <w:ilvl w:val="0"/>
+          <w:numId w:val="1"/>
+        </w:numPr>
+        <w:spacing w:lineRule="auto" w:line="276"/>
+        <w:rPr/>
+      </w:pPr>
+      <w:r>
+        <w:rPr/>
+        <w:t xml:space="preserve">A web interface, and automated posting to GitHub. Sessions start from Python interfaces or scripts, and a person posts approved issue drafts.</w:t>
       </w:r>
     </w:p>
     <w:p>
@@ -5341,6 +5253,7 @@
     <w:uiPriority w:val="9"/>
     <w:qFormat/>
     <w:pPr>
+      <w:keepNext/>
       <w:widowControl/>
       <w:bidi w:val="0"/>
       <w:spacing w:lineRule="atLeast" w:line="276" w:before="0" w:after="160"/>
@@ -5363,6 +5276,7 @@
     <w:unhideWhenUsed/>
     <w:qFormat/>
     <w:pPr>
+      <w:keepNext/>
       <w:widowControl/>
       <w:bidi w:val="0"/>
       <w:spacing w:lineRule="atLeast" w:line="276" w:before="0" w:after="160"/>

</xml_diff>